<commit_message>
Fix Dr. salutation bug in RL-4, update Q&A doc
</commit_message>
<xml_diff>
--- a/docs/qa_document.docx
+++ b/docs/qa_document.docx
@@ -19,7 +19,7 @@
           <w:i/>
           <w:iCs/>
         </w:rPr>
-        <w:t xml:space="preserve">gbhorne/adk-referral-letter-agent  |  Project 4 of 9  |  Healthcare Agentic AI Portfolio</w:t>
+        <w:t xml:space="preserve">gbhorne/adk-referral-letter-agent  |  Healthcare Agentic AI Portfolio</w:t>
       </w:r>
     </w:p>
     <w:p>
@@ -151,7 +151,7 @@
           <w:sz w:val="24"/>
           <w:szCs w:val="24"/>
         </w:rPr>
-        <w:t xml:space="preserve">The FHIR client get_practitioner method returns None cleanly rather than raising. RL-1 stores None in the ReferralContext.performer field. RL-4 addresses the letter to the specialty generically ('Dear Cardiology Specialist,'). RL-5 sets the description to 'performer TBD'. The pipeline completes normally -- this is an expected production state, not an error condition.</w:t>
+        <w:t xml:space="preserve">The FHIR client get_practitioner method returns None cleanly rather than raising. RL-1 stores None in the ReferralContext.performer field. RL-4 addresses the letter to the specialty generically. RL-5 sets the description to performer TBD. The pipeline completes normally -- this is an expected production state, not an error condition.</w:t>
       </w:r>
     </w:p>
     <w:p>
@@ -182,7 +182,7 @@
           <w:sz w:val="24"/>
           <w:szCs w:val="24"/>
         </w:rPr>
-        <w:t xml:space="preserve">The human review gate is a deliberate safety control. The agent generates a draft -- it does not finalize clinical documentation autonomously. The referring clinician must promote the DocumentReference from preliminary to final before the document is visible to downstream consumers or released to the patient portal. This is consistent with the human-in-the-loop pattern across all four projects in this series.</w:t>
+        <w:t xml:space="preserve">The human review gate is a deliberate safety control. The agent generates a draft -- it does not finalize clinical documentation autonomously. The referring clinician must promote the DocumentReference from preliminary to final before the document is visible to downstream consumers or released to the patient portal.</w:t>
       </w:r>
     </w:p>
     <w:p>
@@ -252,7 +252,7 @@
           <w:sz w:val="24"/>
           <w:szCs w:val="24"/>
         </w:rPr>
-        <w:t xml:space="preserve">Firestore stores the per-referral urgency audit record: document ID, service request ID, patient ID, specialty, urgency level, rationale, confidence score, topic routed to, and whether a Communication resource was created. Firestore is appropriate here because this is operational state -- individual record lookup by document ID is the primary access pattern. BigQuery would be appropriate for the CDI agent (Project 6) where cohort-level analytics across hundreds of encounters is the primary use case.</w:t>
+        <w:t xml:space="preserve">Firestore stores the per-referral urgency audit record: document ID, service request ID, patient ID, specialty, urgency level, rationale, confidence score, topic routed to, and whether a Communication resource was created. Firestore is appropriate here because this is operational state -- individual record lookup by document ID is the primary access pattern. BigQuery would be appropriate for the CDI agent where cohort-level analytics across hundreds of encounters is the primary use case.</w:t>
       </w:r>
     </w:p>
     <w:p>
@@ -314,7 +314,7 @@
           <w:sz w:val="24"/>
           <w:szCs w:val="24"/>
         </w:rPr>
-        <w:t xml:space="preserve">The current build runs as a local ADK process. The Cloud Run deployment target handles scaling -- the agent is stateless between invocations, Pub/Sub push subscriptions handle concurrency, and the FHIR store and Firestore are fully managed. The main scaling consideration is Vertex AI quota for Gemini calls -- three LLM calls per referral (RL-2, RL-3, RL-4) against a high-volume referral queue would require quota planning.</w:t>
+        <w:t xml:space="preserve">The current build runs as a local ADK process. The Cloud Run deployment target handles scaling -- the agent is stateless between invocations, Pub/Sub push subscriptions handle concurrency, and the FHIR store and Firestore are fully managed. The main scaling consideration is Vertex AI quota for Gemini calls -- three LLM calls per referral against a high-volume referral queue would require quota planning.</w:t>
       </w:r>
     </w:p>
     <w:p>
@@ -415,7 +415,7 @@
           <w:sz w:val="24"/>
           <w:szCs w:val="24"/>
         </w:rPr>
-        <w:t xml:space="preserve">The RL-2 prompt instructs Gemini to classify EMERGENT when the clinical picture suggests same-day risk -- acute presentations with objective markers of severity (elevated troponin, hemodynamic instability, neurological change), referrals explicitly marked urgent in the ServiceRequest, or conditions where delayed specialist assessment would result in foreseeable harm. In the test run, acute chest pain with troponin 0.8 ng/mL was correctly classified EMERGENT with 0.95 confidence.</w:t>
+        <w:t xml:space="preserve">The RL-2 prompt instructs Gemini to classify EMERGENT when the clinical picture suggests same-day risk -- acute presentations with objective markers of severity such as elevated troponin, hemodynamic instability, or neurological change. In the test run, acute chest pain with troponin 0.8 ng/mL was correctly classified EMERGENT with 0.95 confidence.</w:t>
       </w:r>
     </w:p>
     <w:p>
@@ -516,7 +516,7 @@
           <w:sz w:val="24"/>
           <w:szCs w:val="24"/>
         </w:rPr>
-        <w:t xml:space="preserve">For a linear six-step pipeline with one conditional branch, both work cleanly. ADK is better for rapid prototyping and demo -- the ADK Web UI trace shows each tool invocation in real time without any additional configuration. LangGraph is better for production -- the typed state schema, deterministic conditional edges, and LangSmith tracing give you more control over the execution model and more visibility into state transitions. The honest answer is that the difference matters more as complexity increases -- it becomes more significant in the Clinical Handoff Agent (Project 5) where LangGraph's Send API handles parallel patient processing more naturally.</w:t>
+        <w:t xml:space="preserve">For a linear six-step pipeline with one conditional branch, both work cleanly. ADK is better for rapid prototyping and demo -- the ADK Web UI trace shows each tool invocation in real time without additional configuration. LangGraph is better for production -- the typed state schema, deterministic conditional edges, and LangSmith tracing give more control over the execution model. The difference becomes more significant in the Clinical Handoff Agent where LangGraph Send API handles parallel patient processing more naturally.</w:t>
       </w:r>
     </w:p>
     <w:p>
@@ -547,7 +547,7 @@
           <w:sz w:val="24"/>
           <w:szCs w:val="24"/>
         </w:rPr>
-        <w:t xml:space="preserve">Six separate tools would require Gemini to decide the execution order at runtime, introducing non-determinism. The referral pipeline is strictly sequential with data dependencies between steps -- RL-2 requires RL-1 output, RL-3 requires RL-1 output, and so on. A single orchestrating function executes the steps in guaranteed order, passing typed Pydantic objects between them. The ADK agent's role is to invoke the pipeline with the correct service request ID, not to orchestrate the individual steps.</w:t>
+        <w:t xml:space="preserve">Six separate tools would require Gemini to decide the execution order at runtime, introducing non-determinism. The referral pipeline is strictly sequential with data dependencies between steps. A single orchestrating function executes the steps in guaranteed order, passing typed Pydantic objects between them. The ADK agent's role is to invoke the pipeline with the correct service request ID, not to orchestrate the individual steps.</w:t>
       </w:r>
     </w:p>
     <w:sectPr>

</xml_diff>

<commit_message>
Add disclaimer and sample referral letter to README and Q&A doc
</commit_message>
<xml_diff>
--- a/docs/qa_document.docx
+++ b/docs/qa_document.docx
@@ -12,7 +12,7 @@
     </w:p>
     <w:p>
       <w:pPr>
-        <w:spacing w:after="320"/>
+        <w:spacing w:after="200"/>
       </w:pPr>
       <w:r>
         <w:rPr>
@@ -24,6 +24,33 @@
     </w:p>
     <w:p>
       <w:pPr>
+        <w:pBdr>
+          <w:left w:val="single" w:color="E24B4A" w:sz="12" w:space="8"/>
+        </w:pBdr>
+        <w:spacing w:before="0" w:after="320"/>
+        <w:ind w:left="240"/>
+      </w:pPr>
+      <w:r>
+        <w:rPr>
+          <w:b/>
+          <w:bCs/>
+          <w:sz w:val="22"/>
+          <w:szCs w:val="22"/>
+        </w:rPr>
+        <w:t xml:space="preserve">Disclaimer: </w:t>
+      </w:r>
+      <w:r>
+        <w:rPr>
+          <w:i/>
+          <w:iCs/>
+          <w:sz w:val="22"/>
+          <w:szCs w:val="22"/>
+        </w:rPr>
+        <w:t xml:space="preserve">This project uses entirely synthetic, fictitious FHIR data generated for demonstration purposes only. No real patient data, protected health information, or actual clinical records are used at any stage. All patient names, clinical values, diagnoses, and medications are fabricated. This project is not intended for clinical use.</w:t>
+      </w:r>
+    </w:p>
+    <w:p>
+      <w:pPr>
         <w:pStyle w:val="Heading2"/>
       </w:pPr>
       <w:r>
@@ -547,7 +574,7 @@
           <w:sz w:val="24"/>
           <w:szCs w:val="24"/>
         </w:rPr>
-        <w:t xml:space="preserve">Six separate tools would require Gemini to decide the execution order at runtime, introducing non-determinism. The referral pipeline is strictly sequential with data dependencies between steps. A single orchestrating function executes the steps in guaranteed order, passing typed Pydantic objects between them. The ADK agent's role is to invoke the pipeline with the correct service request ID, not to orchestrate the individual steps.</w:t>
+        <w:t xml:space="preserve">Six separate tools would require Gemini to decide the execution order at runtime, introducing non-determinism. The referral pipeline is strictly sequential with data dependencies between steps. A single orchestrating function executes the steps in guaranteed order, passing typed Pydantic objects between them. The ADK agent role is to invoke the pipeline with the correct service request ID, not to orchestrate the individual steps.</w:t>
       </w:r>
     </w:p>
     <w:sectPr>

</xml_diff>